<commit_message>
fix: audit & fix all popup dialog button glitches
- Button.jsx: add type='button' default to prevent accidental form submission
- Members.jsx: disable Cancel/X during async ops in ConfirmModal; guard role-change prompt buttons with submitting state
- Events.jsx: add deleting state with loading/disabled on delete confirm buttons; add X close guard; use variant='danger' properly
- Expenses.jsx: gate onClose during save/upload; disable Cancel/Upload while in-flight; X close guard
- Settings.jsx: disable Cancel and Save in EditMemberModal while saving
</commit_message>
<xml_diff>
--- a/welfare prompt.docx
+++ b/welfare prompt.docx
@@ -12,7 +12,7 @@
         </w:rPr>
       </w:pPr>
       <w:r>
-        <w:pict w14:anchorId="5FCCC600">
+        <w:pict w14:anchorId="049E588D">
           <v:rect id="Rectangle 137" o:spid="_x0000_s1092" alt="" style="width:468pt;height:.05pt;visibility:visible;mso-wrap-style:square;mso-width-percent:0;mso-height-percent:0;mso-left-percent:-10001;mso-top-percent:-10001;mso-position-horizontal:absolute;mso-position-horizontal-relative:char;mso-position-vertical:absolute;mso-position-vertical-relative:line;mso-width-percent:0;mso-height-percent:0;mso-left-percent:-10001;mso-top-percent:-10001;v-text-anchor:top" filled="f">
             <o:lock v:ext="edit" aspectratio="t"/>
             <w10:anchorlock/>
@@ -30,7 +30,7 @@
         </w:rPr>
       </w:pPr>
       <w:r>
-        <w:pict w14:anchorId="0D9F1B6C">
+        <w:pict w14:anchorId="1DA5CBBB">
           <v:rect id="Rectangle 135" o:spid="_x0000_s1091" alt="" style="width:468pt;height:.05pt;visibility:visible;mso-wrap-style:square;mso-width-percent:0;mso-height-percent:0;mso-left-percent:-10001;mso-top-percent:-10001;mso-position-horizontal:absolute;mso-position-horizontal-relative:char;mso-position-vertical:absolute;mso-position-vertical-relative:line;mso-width-percent:0;mso-height-percent:0;mso-left-percent:-10001;mso-top-percent:-10001;v-text-anchor:top" filled="f">
             <o:lock v:ext="edit" aspectratio="t"/>
             <w10:anchorlock/>
@@ -102,7 +102,7 @@
         </w:rPr>
       </w:pPr>
       <w:r>
-        <w:pict w14:anchorId="012A6601">
+        <w:pict w14:anchorId="1E578FFA">
           <v:rect id="Rectangle 133" o:spid="_x0000_s1090" alt="" style="width:468pt;height:.05pt;visibility:visible;mso-wrap-style:square;mso-width-percent:0;mso-height-percent:0;mso-left-percent:-10001;mso-top-percent:-10001;mso-position-horizontal:absolute;mso-position-horizontal-relative:char;mso-position-vertical:absolute;mso-position-vertical-relative:line;mso-width-percent:0;mso-height-percent:0;mso-left-percent:-10001;mso-top-percent:-10001;v-text-anchor:top" filled="f">
             <o:lock v:ext="edit" aspectratio="t"/>
             <w10:anchorlock/>
@@ -183,7 +183,7 @@
         </w:rPr>
       </w:pPr>
       <w:r>
-        <w:pict w14:anchorId="3D477C03">
+        <w:pict w14:anchorId="1FE34E30">
           <v:rect id="Rectangle 131" o:spid="_x0000_s1089" alt="" style="width:468pt;height:.05pt;visibility:visible;mso-wrap-style:square;mso-width-percent:0;mso-height-percent:0;mso-left-percent:-10001;mso-top-percent:-10001;mso-position-horizontal:absolute;mso-position-horizontal-relative:char;mso-position-vertical:absolute;mso-position-vertical-relative:line;mso-width-percent:0;mso-height-percent:0;mso-left-percent:-10001;mso-top-percent:-10001;v-text-anchor:top" filled="f">
             <o:lock v:ext="edit" aspectratio="t"/>
             <w10:anchorlock/>
@@ -1199,7 +1199,7 @@
         </w:rPr>
       </w:pPr>
       <w:r>
-        <w:pict w14:anchorId="0E9DA4AF">
+        <w:pict w14:anchorId="22C36C39">
           <v:rect id="Rectangle 129" o:spid="_x0000_s1088" alt="" style="width:468pt;height:.05pt;visibility:visible;mso-wrap-style:square;mso-width-percent:0;mso-height-percent:0;mso-left-percent:-10001;mso-top-percent:-10001;mso-position-horizontal:absolute;mso-position-horizontal-relative:char;mso-position-vertical:absolute;mso-position-vertical-relative:line;mso-width-percent:0;mso-height-percent:0;mso-left-percent:-10001;mso-top-percent:-10001;v-text-anchor:top" filled="f">
             <o:lock v:ext="edit" aspectratio="t"/>
             <w10:anchorlock/>
@@ -2320,7 +2320,7 @@
         </w:rPr>
       </w:pPr>
       <w:r>
-        <w:pict w14:anchorId="515D7346">
+        <w:pict w14:anchorId="10A6BE61">
           <v:rect id="Rectangle 127" o:spid="_x0000_s1087" alt="" style="width:468pt;height:.05pt;visibility:visible;mso-wrap-style:square;mso-width-percent:0;mso-height-percent:0;mso-left-percent:-10001;mso-top-percent:-10001;mso-position-horizontal:absolute;mso-position-horizontal-relative:char;mso-position-vertical:absolute;mso-position-vertical-relative:line;mso-width-percent:0;mso-height-percent:0;mso-left-percent:-10001;mso-top-percent:-10001;v-text-anchor:top" filled="f">
             <o:lock v:ext="edit" aspectratio="t"/>
             <w10:anchorlock/>
@@ -2338,7 +2338,7 @@
         </w:rPr>
       </w:pPr>
       <w:r>
-        <w:pict w14:anchorId="5CE1F49F">
+        <w:pict w14:anchorId="59BE9371">
           <v:rect id="Rectangle 125" o:spid="_x0000_s1086" alt="" style="width:468pt;height:.05pt;visibility:visible;mso-wrap-style:square;mso-width-percent:0;mso-height-percent:0;mso-left-percent:-10001;mso-top-percent:-10001;mso-position-horizontal:absolute;mso-position-horizontal-relative:char;mso-position-vertical:absolute;mso-position-vertical-relative:line;mso-width-percent:0;mso-height-percent:0;mso-left-percent:-10001;mso-top-percent:-10001;v-text-anchor:top" filled="f">
             <o:lock v:ext="edit" aspectratio="t"/>
             <w10:anchorlock/>
@@ -2356,7 +2356,7 @@
         </w:rPr>
       </w:pPr>
       <w:r>
-        <w:pict w14:anchorId="2663C772">
+        <w:pict w14:anchorId="6055D123">
           <v:rect id="Rectangle 123" o:spid="_x0000_s1085" alt="" style="width:468pt;height:.05pt;visibility:visible;mso-wrap-style:square;mso-width-percent:0;mso-height-percent:0;mso-left-percent:-10001;mso-top-percent:-10001;mso-position-horizontal:absolute;mso-position-horizontal-relative:char;mso-position-vertical:absolute;mso-position-vertical-relative:line;mso-width-percent:0;mso-height-percent:0;mso-left-percent:-10001;mso-top-percent:-10001;v-text-anchor:top" filled="f">
             <o:lock v:ext="edit" aspectratio="t"/>
             <w10:anchorlock/>
@@ -2428,7 +2428,7 @@
         </w:rPr>
       </w:pPr>
       <w:r>
-        <w:pict w14:anchorId="0110C286">
+        <w:pict w14:anchorId="6765D0BC">
           <v:rect id="Rectangle 121" o:spid="_x0000_s1084" alt="" style="width:468pt;height:.05pt;visibility:visible;mso-wrap-style:square;mso-width-percent:0;mso-height-percent:0;mso-left-percent:-10001;mso-top-percent:-10001;mso-position-horizontal:absolute;mso-position-horizontal-relative:char;mso-position-vertical:absolute;mso-position-vertical-relative:line;mso-width-percent:0;mso-height-percent:0;mso-left-percent:-10001;mso-top-percent:-10001;v-text-anchor:top" filled="f">
             <o:lock v:ext="edit" aspectratio="t"/>
             <w10:anchorlock/>
@@ -2491,7 +2491,7 @@
         </w:rPr>
       </w:pPr>
       <w:r>
-        <w:pict w14:anchorId="6828E3B7">
+        <w:pict w14:anchorId="355E280D">
           <v:rect id="Rectangle 119" o:spid="_x0000_s1083" alt="" style="width:468pt;height:.05pt;visibility:visible;mso-wrap-style:square;mso-width-percent:0;mso-height-percent:0;mso-left-percent:-10001;mso-top-percent:-10001;mso-position-horizontal:absolute;mso-position-horizontal-relative:char;mso-position-vertical:absolute;mso-position-vertical-relative:line;mso-width-percent:0;mso-height-percent:0;mso-left-percent:-10001;mso-top-percent:-10001;v-text-anchor:top" filled="f">
             <o:lock v:ext="edit" aspectratio="t"/>
             <w10:anchorlock/>
@@ -3062,7 +3062,7 @@
         </w:rPr>
       </w:pPr>
       <w:r>
-        <w:pict w14:anchorId="1DD57FF6">
+        <w:pict w14:anchorId="6C5959B6">
           <v:rect id="Rectangle 117" o:spid="_x0000_s1082" alt="" style="width:468pt;height:1.1pt;visibility:visible;mso-wrap-style:square;mso-width-percent:0;mso-height-percent:0;mso-left-percent:-10001;mso-top-percent:-10001;mso-position-horizontal:absolute;mso-position-horizontal-relative:char;mso-position-vertical:absolute;mso-position-vertical-relative:line;mso-width-percent:0;mso-height-percent:0;mso-left-percent:-10001;mso-top-percent:-10001;v-text-anchor:top" filled="f">
             <o:lock v:ext="edit" aspectratio="t"/>
             <w10:anchorlock/>
@@ -3438,7 +3438,7 @@
         </w:rPr>
       </w:pPr>
       <w:r>
-        <w:pict w14:anchorId="503E28E4">
+        <w:pict w14:anchorId="1F18A0FF">
           <v:rect id="Rectangle 115" o:spid="_x0000_s1081" alt="" style="width:468pt;height:.05pt;visibility:visible;mso-wrap-style:square;mso-width-percent:0;mso-height-percent:0;mso-left-percent:-10001;mso-top-percent:-10001;mso-position-horizontal:absolute;mso-position-horizontal-relative:char;mso-position-vertical:absolute;mso-position-vertical-relative:line;mso-width-percent:0;mso-height-percent:0;mso-left-percent:-10001;mso-top-percent:-10001;v-text-anchor:top" filled="f">
             <o:lock v:ext="edit" aspectratio="t"/>
             <w10:anchorlock/>
@@ -3538,7 +3538,7 @@
         </w:rPr>
       </w:pPr>
       <w:r>
-        <w:pict w14:anchorId="0AE23B01">
+        <w:pict w14:anchorId="1461141F">
           <v:rect id="Rectangle 113" o:spid="_x0000_s1080" alt="" style="width:468pt;height:1.1pt;visibility:visible;mso-wrap-style:square;mso-width-percent:0;mso-height-percent:0;mso-left-percent:-10001;mso-top-percent:-10001;mso-position-horizontal:absolute;mso-position-horizontal-relative:char;mso-position-vertical:absolute;mso-position-vertical-relative:line;mso-width-percent:0;mso-height-percent:0;mso-left-percent:-10001;mso-top-percent:-10001;v-text-anchor:top" filled="f">
             <o:lock v:ext="edit" aspectratio="t"/>
             <w10:anchorlock/>
@@ -3594,7 +3594,7 @@
         </w:rPr>
       </w:pPr>
       <w:r>
-        <w:pict w14:anchorId="3508B3B7">
+        <w:pict w14:anchorId="636B32A0">
           <v:rect id="Rectangle 111" o:spid="_x0000_s1079" alt="" style="width:468pt;height:.05pt;visibility:visible;mso-wrap-style:square;mso-width-percent:0;mso-height-percent:0;mso-left-percent:-10001;mso-top-percent:-10001;mso-position-horizontal:absolute;mso-position-horizontal-relative:char;mso-position-vertical:absolute;mso-position-vertical-relative:line;mso-width-percent:0;mso-height-percent:0;mso-left-percent:-10001;mso-top-percent:-10001;v-text-anchor:top" filled="f">
             <o:lock v:ext="edit" aspectratio="t"/>
             <w10:anchorlock/>
@@ -3650,7 +3650,7 @@
         </w:rPr>
       </w:pPr>
       <w:r>
-        <w:pict w14:anchorId="3F757965">
+        <w:pict w14:anchorId="4BB3EB40">
           <v:rect id="Rectangle 109" o:spid="_x0000_s1078" alt="" style="width:468pt;height:.05pt;visibility:visible;mso-wrap-style:square;mso-width-percent:0;mso-height-percent:0;mso-left-percent:-10001;mso-top-percent:-10001;mso-position-horizontal:absolute;mso-position-horizontal-relative:char;mso-position-vertical:absolute;mso-position-vertical-relative:line;mso-width-percent:0;mso-height-percent:0;mso-left-percent:-10001;mso-top-percent:-10001;v-text-anchor:top" filled="f">
             <o:lock v:ext="edit" aspectratio="t"/>
             <w10:anchorlock/>
@@ -3794,7 +3794,7 @@
         </w:rPr>
       </w:pPr>
       <w:r>
-        <w:pict w14:anchorId="0E21A2DC">
+        <w:pict w14:anchorId="0AD329CC">
           <v:rect id="Rectangle 107" o:spid="_x0000_s1077" alt="" style="width:468pt;height:.05pt;visibility:visible;mso-wrap-style:square;mso-width-percent:0;mso-height-percent:0;mso-left-percent:-10001;mso-top-percent:-10001;mso-position-horizontal:absolute;mso-position-horizontal-relative:char;mso-position-vertical:absolute;mso-position-vertical-relative:line;mso-width-percent:0;mso-height-percent:0;mso-left-percent:-10001;mso-top-percent:-10001;v-text-anchor:top" filled="f">
             <o:lock v:ext="edit" aspectratio="t"/>
             <w10:anchorlock/>
@@ -3812,7 +3812,7 @@
         </w:rPr>
       </w:pPr>
       <w:r>
-        <w:pict w14:anchorId="3EB59786">
+        <w:pict w14:anchorId="60209E20">
           <v:rect id="Rectangle 105" o:spid="_x0000_s1076" alt="" style="width:468pt;height:.05pt;visibility:visible;mso-wrap-style:square;mso-width-percent:0;mso-height-percent:0;mso-left-percent:-10001;mso-top-percent:-10001;mso-position-horizontal:absolute;mso-position-horizontal-relative:char;mso-position-vertical:absolute;mso-position-vertical-relative:line;mso-width-percent:0;mso-height-percent:0;mso-left-percent:-10001;mso-top-percent:-10001;v-text-anchor:top" filled="f">
             <o:lock v:ext="edit" aspectratio="t"/>
             <w10:anchorlock/>
@@ -3830,7 +3830,7 @@
         </w:rPr>
       </w:pPr>
       <w:r>
-        <w:pict w14:anchorId="0FCEA6C4">
+        <w:pict w14:anchorId="2A89B901">
           <v:rect id="Rectangle 103" o:spid="_x0000_s1075" alt="" style="width:468pt;height:.05pt;visibility:visible;mso-wrap-style:square;mso-width-percent:0;mso-height-percent:0;mso-left-percent:-10001;mso-top-percent:-10001;mso-position-horizontal:absolute;mso-position-horizontal-relative:char;mso-position-vertical:absolute;mso-position-vertical-relative:line;mso-width-percent:0;mso-height-percent:0;mso-left-percent:-10001;mso-top-percent:-10001;v-text-anchor:top" filled="f">
             <o:lock v:ext="edit" aspectratio="t"/>
             <w10:anchorlock/>
@@ -3903,7 +3903,7 @@
         </w:rPr>
       </w:pPr>
       <w:r>
-        <w:pict w14:anchorId="26212F6F">
+        <w:pict w14:anchorId="61600CB3">
           <v:rect id="Rectangle 101" o:spid="_x0000_s1074" alt="" style="width:468pt;height:.05pt;visibility:visible;mso-wrap-style:square;mso-width-percent:0;mso-height-percent:0;mso-left-percent:-10001;mso-top-percent:-10001;mso-position-horizontal:absolute;mso-position-horizontal-relative:char;mso-position-vertical:absolute;mso-position-vertical-relative:line;mso-width-percent:0;mso-height-percent:0;mso-left-percent:-10001;mso-top-percent:-10001;v-text-anchor:top" filled="f">
             <o:lock v:ext="edit" aspectratio="t"/>
             <w10:anchorlock/>
@@ -3948,7 +3948,7 @@
         </w:rPr>
       </w:pPr>
       <w:r>
-        <w:pict w14:anchorId="55B97A77">
+        <w:pict w14:anchorId="0576B487">
           <v:rect id="Rectangle 99" o:spid="_x0000_s1073" alt="" style="width:468pt;height:.05pt;visibility:visible;mso-wrap-style:square;mso-width-percent:0;mso-height-percent:0;mso-left-percent:-10001;mso-top-percent:-10001;mso-position-horizontal:absolute;mso-position-horizontal-relative:char;mso-position-vertical:absolute;mso-position-vertical-relative:line;mso-width-percent:0;mso-height-percent:0;mso-left-percent:-10001;mso-top-percent:-10001;v-text-anchor:top" filled="f">
             <o:lock v:ext="edit" aspectratio="t"/>
             <w10:anchorlock/>
@@ -4206,7 +4206,7 @@
         </w:rPr>
       </w:pPr>
       <w:r>
-        <w:pict w14:anchorId="6DCA4655">
+        <w:pict w14:anchorId="18ED4D02">
           <v:rect id="Rectangle 97" o:spid="_x0000_s1072" alt="" style="width:468pt;height:1.1pt;visibility:visible;mso-wrap-style:square;mso-width-percent:0;mso-height-percent:0;mso-left-percent:-10001;mso-top-percent:-10001;mso-position-horizontal:absolute;mso-position-horizontal-relative:char;mso-position-vertical:absolute;mso-position-vertical-relative:line;mso-width-percent:0;mso-height-percent:0;mso-left-percent:-10001;mso-top-percent:-10001;v-text-anchor:top" filled="f">
             <o:lock v:ext="edit" aspectratio="t"/>
             <w10:anchorlock/>
@@ -4737,7 +4737,7 @@
         </w:rPr>
       </w:pPr>
       <w:r>
-        <w:pict w14:anchorId="309A6F74">
+        <w:pict w14:anchorId="564D5CA6">
           <v:rect id="Rectangle 95" o:spid="_x0000_s1071" alt="" style="width:468pt;height:1.1pt;visibility:visible;mso-wrap-style:square;mso-width-percent:0;mso-height-percent:0;mso-left-percent:-10001;mso-top-percent:-10001;mso-position-horizontal:absolute;mso-position-horizontal-relative:char;mso-position-vertical:absolute;mso-position-vertical-relative:line;mso-width-percent:0;mso-height-percent:0;mso-left-percent:-10001;mso-top-percent:-10001;v-text-anchor:top" filled="f">
             <o:lock v:ext="edit" aspectratio="t"/>
             <w10:anchorlock/>
@@ -4755,7 +4755,7 @@
         </w:rPr>
       </w:pPr>
       <w:r>
-        <w:pict w14:anchorId="27DF8169">
+        <w:pict w14:anchorId="45929FE3">
           <v:rect id="Rectangle 93" o:spid="_x0000_s1070" alt="" style="width:468pt;height:1.1pt;visibility:visible;mso-wrap-style:square;mso-width-percent:0;mso-height-percent:0;mso-left-percent:-10001;mso-top-percent:-10001;mso-position-horizontal:absolute;mso-position-horizontal-relative:char;mso-position-vertical:absolute;mso-position-vertical-relative:line;mso-width-percent:0;mso-height-percent:0;mso-left-percent:-10001;mso-top-percent:-10001;v-text-anchor:top" filled="f">
             <o:lock v:ext="edit" aspectratio="t"/>
             <w10:anchorlock/>
@@ -4773,7 +4773,7 @@
         </w:rPr>
       </w:pPr>
       <w:r>
-        <w:pict w14:anchorId="3EBC9EBF">
+        <w:pict w14:anchorId="08569F88">
           <v:rect id="Rectangle 91" o:spid="_x0000_s1069" alt="" style="width:468pt;height:1.1pt;visibility:visible;mso-wrap-style:square;mso-width-percent:0;mso-height-percent:0;mso-left-percent:-10001;mso-top-percent:-10001;mso-position-horizontal:absolute;mso-position-horizontal-relative:char;mso-position-vertical:absolute;mso-position-vertical-relative:line;mso-width-percent:0;mso-height-percent:0;mso-left-percent:-10001;mso-top-percent:-10001;v-text-anchor:top" filled="f">
             <o:lock v:ext="edit" aspectratio="t"/>
             <w10:anchorlock/>
@@ -4845,7 +4845,7 @@
         </w:rPr>
       </w:pPr>
       <w:r>
-        <w:pict w14:anchorId="724C94FB">
+        <w:pict w14:anchorId="6C7F6558">
           <v:rect id="Rectangle 89" o:spid="_x0000_s1068" alt="" style="width:468pt;height:.05pt;visibility:visible;mso-wrap-style:square;mso-width-percent:0;mso-height-percent:0;mso-left-percent:-10001;mso-top-percent:-10001;mso-position-horizontal:absolute;mso-position-horizontal-relative:char;mso-position-vertical:absolute;mso-position-vertical-relative:line;mso-width-percent:0;mso-height-percent:0;mso-left-percent:-10001;mso-top-percent:-10001;v-text-anchor:top" filled="f">
             <o:lock v:ext="edit" aspectratio="t"/>
             <w10:anchorlock/>
@@ -4890,7 +4890,7 @@
         </w:rPr>
       </w:pPr>
       <w:r>
-        <w:pict w14:anchorId="7418BF70">
+        <w:pict w14:anchorId="5BAD7A11">
           <v:rect id="Rectangle 87" o:spid="_x0000_s1067" alt="" style="width:468pt;height:1.1pt;visibility:visible;mso-wrap-style:square;mso-width-percent:0;mso-height-percent:0;mso-left-percent:-10001;mso-top-percent:-10001;mso-position-horizontal:absolute;mso-position-horizontal-relative:char;mso-position-vertical:absolute;mso-position-vertical-relative:line;mso-width-percent:0;mso-height-percent:0;mso-left-percent:-10001;mso-top-percent:-10001;v-text-anchor:top" filled="f">
             <o:lock v:ext="edit" aspectratio="t"/>
             <w10:anchorlock/>
@@ -5583,7 +5583,7 @@
         </w:rPr>
       </w:pPr>
       <w:r>
-        <w:pict w14:anchorId="7A4A5230">
+        <w:pict w14:anchorId="58538137">
           <v:rect id="Rectangle 85" o:spid="_x0000_s1066" alt="" style="width:468pt;height:1.1pt;visibility:visible;mso-wrap-style:square;mso-width-percent:0;mso-height-percent:0;mso-left-percent:-10001;mso-top-percent:-10001;mso-position-horizontal:absolute;mso-position-horizontal-relative:char;mso-position-vertical:absolute;mso-position-vertical-relative:line;mso-width-percent:0;mso-height-percent:0;mso-left-percent:-10001;mso-top-percent:-10001;v-text-anchor:top" filled="f">
             <o:lock v:ext="edit" aspectratio="t"/>
             <w10:anchorlock/>
@@ -6063,7 +6063,7 @@
         </w:rPr>
       </w:pPr>
       <w:r>
-        <w:pict w14:anchorId="2D51245C">
+        <w:pict w14:anchorId="7C097987">
           <v:rect id="Rectangle 83" o:spid="_x0000_s1065" alt="" style="width:468pt;height:.05pt;visibility:visible;mso-wrap-style:square;mso-width-percent:0;mso-height-percent:0;mso-left-percent:-10001;mso-top-percent:-10001;mso-position-horizontal:absolute;mso-position-horizontal-relative:char;mso-position-vertical:absolute;mso-position-vertical-relative:line;mso-width-percent:0;mso-height-percent:0;mso-left-percent:-10001;mso-top-percent:-10001;v-text-anchor:top" filled="f">
             <o:lock v:ext="edit" aspectratio="t"/>
             <w10:anchorlock/>
@@ -6081,7 +6081,7 @@
         </w:rPr>
       </w:pPr>
       <w:r>
-        <w:pict w14:anchorId="31C478AE">
+        <w:pict w14:anchorId="0D59B80E">
           <v:rect id="Rectangle 81" o:spid="_x0000_s1064" alt="" style="width:468pt;height:.05pt;visibility:visible;mso-wrap-style:square;mso-width-percent:0;mso-height-percent:0;mso-left-percent:-10001;mso-top-percent:-10001;mso-position-horizontal:absolute;mso-position-horizontal-relative:char;mso-position-vertical:absolute;mso-position-vertical-relative:line;mso-width-percent:0;mso-height-percent:0;mso-left-percent:-10001;mso-top-percent:-10001;v-text-anchor:top" filled="f">
             <o:lock v:ext="edit" aspectratio="t"/>
             <w10:anchorlock/>
@@ -6099,7 +6099,7 @@
         </w:rPr>
       </w:pPr>
       <w:r>
-        <w:pict w14:anchorId="39FDD144">
+        <w:pict w14:anchorId="206B9718">
           <v:rect id="Rectangle 79" o:spid="_x0000_s1063" alt="" style="width:468pt;height:.05pt;visibility:visible;mso-wrap-style:square;mso-width-percent:0;mso-height-percent:0;mso-left-percent:-10001;mso-top-percent:-10001;mso-position-horizontal:absolute;mso-position-horizontal-relative:char;mso-position-vertical:absolute;mso-position-vertical-relative:line;mso-width-percent:0;mso-height-percent:0;mso-left-percent:-10001;mso-top-percent:-10001;v-text-anchor:top" filled="f">
             <o:lock v:ext="edit" aspectratio="t"/>
             <w10:anchorlock/>
@@ -6171,7 +6171,7 @@
         </w:rPr>
       </w:pPr>
       <w:r>
-        <w:pict w14:anchorId="3CD0254A">
+        <w:pict w14:anchorId="74BC54D5">
           <v:rect id="Rectangle 77" o:spid="_x0000_s1062" alt="" style="width:468pt;height:.05pt;visibility:visible;mso-wrap-style:square;mso-width-percent:0;mso-height-percent:0;mso-left-percent:-10001;mso-top-percent:-10001;mso-position-horizontal:absolute;mso-position-horizontal-relative:char;mso-position-vertical:absolute;mso-position-vertical-relative:line;mso-width-percent:0;mso-height-percent:0;mso-left-percent:-10001;mso-top-percent:-10001;v-text-anchor:top" filled="f">
             <o:lock v:ext="edit" aspectratio="t"/>
             <w10:anchorlock/>
@@ -6216,7 +6216,7 @@
         </w:rPr>
       </w:pPr>
       <w:r>
-        <w:pict w14:anchorId="224FFABD">
+        <w:pict w14:anchorId="46F7298A">
           <v:rect id="Rectangle 75" o:spid="_x0000_s1061" alt="" style="width:468pt;height:1.1pt;visibility:visible;mso-wrap-style:square;mso-width-percent:0;mso-height-percent:0;mso-left-percent:-10001;mso-top-percent:-10001;mso-position-horizontal:absolute;mso-position-horizontal-relative:char;mso-position-vertical:absolute;mso-position-vertical-relative:line;mso-width-percent:0;mso-height-percent:0;mso-left-percent:-10001;mso-top-percent:-10001;v-text-anchor:top" filled="f">
             <o:lock v:ext="edit" aspectratio="t"/>
             <w10:anchorlock/>
@@ -6562,7 +6562,7 @@
         </w:rPr>
       </w:pPr>
       <w:r>
-        <w:pict w14:anchorId="4FEB3552">
+        <w:pict w14:anchorId="3FA829D5">
           <v:rect id="Rectangle 73" o:spid="_x0000_s1060" alt="" style="width:468pt;height:1.1pt;visibility:visible;mso-wrap-style:square;mso-width-percent:0;mso-height-percent:0;mso-left-percent:-10001;mso-top-percent:-10001;mso-position-horizontal:absolute;mso-position-horizontal-relative:char;mso-position-vertical:absolute;mso-position-vertical-relative:line;mso-width-percent:0;mso-height-percent:0;mso-left-percent:-10001;mso-top-percent:-10001;v-text-anchor:top" filled="f">
             <o:lock v:ext="edit" aspectratio="t"/>
             <w10:anchorlock/>
@@ -6724,7 +6724,7 @@
         </w:rPr>
       </w:pPr>
       <w:r>
-        <w:pict w14:anchorId="67E81621">
+        <w:pict w14:anchorId="38B5A3FE">
           <v:rect id="Rectangle 71" o:spid="_x0000_s1059" alt="" style="width:468pt;height:1.1pt;visibility:visible;mso-wrap-style:square;mso-width-percent:0;mso-height-percent:0;mso-left-percent:-10001;mso-top-percent:-10001;mso-position-horizontal:absolute;mso-position-horizontal-relative:char;mso-position-vertical:absolute;mso-position-vertical-relative:line;mso-width-percent:0;mso-height-percent:0;mso-left-percent:-10001;mso-top-percent:-10001;v-text-anchor:top" filled="f">
             <o:lock v:ext="edit" aspectratio="t"/>
             <w10:anchorlock/>
@@ -6909,7 +6909,7 @@
         </w:rPr>
       </w:pPr>
       <w:r>
-        <w:pict w14:anchorId="1B46FD1E">
+        <w:pict w14:anchorId="4F87D47F">
           <v:rect id="Rectangle 69" o:spid="_x0000_s1058" alt="" style="width:468pt;height:1.1pt;visibility:visible;mso-wrap-style:square;mso-width-percent:0;mso-height-percent:0;mso-left-percent:-10001;mso-top-percent:-10001;mso-position-horizontal:absolute;mso-position-horizontal-relative:char;mso-position-vertical:absolute;mso-position-vertical-relative:line;mso-width-percent:0;mso-height-percent:0;mso-left-percent:-10001;mso-top-percent:-10001;v-text-anchor:top" filled="f">
             <o:lock v:ext="edit" aspectratio="t"/>
             <w10:anchorlock/>
@@ -7811,7 +7811,7 @@
         </w:rPr>
       </w:pPr>
       <w:r>
-        <w:pict w14:anchorId="33B10CD2">
+        <w:pict w14:anchorId="6FE71521">
           <v:rect id="Rectangle 67" o:spid="_x0000_s1057" alt="" style="width:468pt;height:.05pt;visibility:visible;mso-wrap-style:square;mso-width-percent:0;mso-height-percent:0;mso-left-percent:-10001;mso-top-percent:-10001;mso-position-horizontal:absolute;mso-position-horizontal-relative:char;mso-position-vertical:absolute;mso-position-vertical-relative:line;mso-width-percent:0;mso-height-percent:0;mso-left-percent:-10001;mso-top-percent:-10001;v-text-anchor:top" filled="f">
             <o:lock v:ext="edit" aspectratio="t"/>
             <w10:anchorlock/>
@@ -7996,7 +7996,7 @@
         </w:rPr>
       </w:pPr>
       <w:r>
-        <w:pict w14:anchorId="32B84168">
+        <w:pict w14:anchorId="54E3BA45">
           <v:rect id="Rectangle 65" o:spid="_x0000_s1056" alt="" style="width:468pt;height:.05pt;visibility:visible;mso-wrap-style:square;mso-width-percent:0;mso-height-percent:0;mso-left-percent:-10001;mso-top-percent:-10001;mso-position-horizontal:absolute;mso-position-horizontal-relative:char;mso-position-vertical:absolute;mso-position-vertical-relative:line;mso-width-percent:0;mso-height-percent:0;mso-left-percent:-10001;mso-top-percent:-10001;v-text-anchor:top" filled="f">
             <o:lock v:ext="edit" aspectratio="t"/>
             <w10:anchorlock/>
@@ -8088,7 +8088,7 @@
         </w:rPr>
       </w:pPr>
       <w:r>
-        <w:pict w14:anchorId="79711046">
+        <w:pict w14:anchorId="5DB1DC89">
           <v:rect id="Rectangle 63" o:spid="_x0000_s1055" alt="" style="width:468pt;height:.05pt;visibility:visible;mso-wrap-style:square;mso-width-percent:0;mso-height-percent:0;mso-left-percent:-10001;mso-top-percent:-10001;mso-position-horizontal:absolute;mso-position-horizontal-relative:char;mso-position-vertical:absolute;mso-position-vertical-relative:line;mso-width-percent:0;mso-height-percent:0;mso-left-percent:-10001;mso-top-percent:-10001;v-text-anchor:top" filled="f">
             <o:lock v:ext="edit" aspectratio="t"/>
             <w10:anchorlock/>
@@ -8268,7 +8268,7 @@
         </w:rPr>
       </w:pPr>
       <w:r>
-        <w:pict w14:anchorId="2D675CE6">
+        <w:pict w14:anchorId="5381990A">
           <v:rect id="Rectangle 61" o:spid="_x0000_s1054" alt="" style="width:468pt;height:.05pt;visibility:visible;mso-wrap-style:square;mso-width-percent:0;mso-height-percent:0;mso-left-percent:-10001;mso-top-percent:-10001;mso-position-horizontal:absolute;mso-position-horizontal-relative:char;mso-position-vertical:absolute;mso-position-vertical-relative:line;mso-width-percent:0;mso-height-percent:0;mso-left-percent:-10001;mso-top-percent:-10001;v-text-anchor:top" filled="f">
             <o:lock v:ext="edit" aspectratio="t"/>
             <w10:anchorlock/>
@@ -8286,7 +8286,7 @@
         </w:rPr>
       </w:pPr>
       <w:r>
-        <w:pict w14:anchorId="6E2496D8">
+        <w:pict w14:anchorId="53D8B4E3">
           <v:rect id="Rectangle 59" o:spid="_x0000_s1053" alt="" style="width:468pt;height:.05pt;visibility:visible;mso-wrap-style:square;mso-width-percent:0;mso-height-percent:0;mso-left-percent:-10001;mso-top-percent:-10001;mso-position-horizontal:absolute;mso-position-horizontal-relative:char;mso-position-vertical:absolute;mso-position-vertical-relative:line;mso-width-percent:0;mso-height-percent:0;mso-left-percent:-10001;mso-top-percent:-10001;v-text-anchor:top" filled="f">
             <o:lock v:ext="edit" aspectratio="t"/>
             <w10:anchorlock/>
@@ -8304,7 +8304,7 @@
         </w:rPr>
       </w:pPr>
       <w:r>
-        <w:pict w14:anchorId="40BB495B">
+        <w:pict w14:anchorId="69E51708">
           <v:rect id="Rectangle 57" o:spid="_x0000_s1052" alt="" style="width:468pt;height:.05pt;visibility:visible;mso-wrap-style:square;mso-width-percent:0;mso-height-percent:0;mso-left-percent:-10001;mso-top-percent:-10001;mso-position-horizontal:absolute;mso-position-horizontal-relative:char;mso-position-vertical:absolute;mso-position-vertical-relative:line;mso-width-percent:0;mso-height-percent:0;mso-left-percent:-10001;mso-top-percent:-10001;v-text-anchor:top" filled="f">
             <o:lock v:ext="edit" aspectratio="t"/>
             <w10:anchorlock/>
@@ -8377,7 +8377,7 @@
         </w:rPr>
       </w:pPr>
       <w:r>
-        <w:pict w14:anchorId="080578B7">
+        <w:pict w14:anchorId="72F8D087">
           <v:rect id="Rectangle 55" o:spid="_x0000_s1051" alt="" style="width:468pt;height:.05pt;visibility:visible;mso-wrap-style:square;mso-width-percent:0;mso-height-percent:0;mso-left-percent:-10001;mso-top-percent:-10001;mso-position-horizontal:absolute;mso-position-horizontal-relative:char;mso-position-vertical:absolute;mso-position-vertical-relative:line;mso-width-percent:0;mso-height-percent:0;mso-left-percent:-10001;mso-top-percent:-10001;v-text-anchor:top" filled="f">
             <o:lock v:ext="edit" aspectratio="t"/>
             <w10:anchorlock/>
@@ -8933,7 +8933,6 @@
           <w:szCs w:val="20"/>
           <w14:ligatures w14:val="none"/>
         </w:rPr>
-        <w:lastRenderedPageBreak/>
         <w:t>My Profile / Change Password modal</w:t>
       </w:r>
     </w:p>
@@ -9289,7 +9288,7 @@
         </w:rPr>
       </w:pPr>
       <w:r>
-        <w:pict w14:anchorId="52874D02">
+        <w:pict w14:anchorId="13AABC36">
           <v:rect id="Rectangle 49" o:spid="_x0000_s1050" alt="" style="width:468pt;height:1.1pt;visibility:visible;mso-wrap-style:square;mso-width-percent:0;mso-height-percent:0;mso-left-percent:-10001;mso-top-percent:-10001;mso-position-horizontal:absolute;mso-position-horizontal-relative:char;mso-position-vertical:absolute;mso-position-vertical-relative:line;mso-width-percent:0;mso-height-percent:0;mso-left-percent:-10001;mso-top-percent:-10001;v-text-anchor:top" filled="f">
             <o:lock v:ext="edit" aspectratio="t"/>
             <w10:anchorlock/>
@@ -9491,7 +9490,7 @@
         </w:rPr>
       </w:pPr>
       <w:r>
-        <w:pict w14:anchorId="3231C411">
+        <w:pict w14:anchorId="6EADA230">
           <v:rect id="Rectangle 47" o:spid="_x0000_s1049" alt="" style="width:468pt;height:1.1pt;visibility:visible;mso-wrap-style:square;mso-width-percent:0;mso-height-percent:0;mso-left-percent:-10001;mso-top-percent:-10001;mso-position-horizontal:absolute;mso-position-horizontal-relative:char;mso-position-vertical:absolute;mso-position-vertical-relative:line;mso-width-percent:0;mso-height-percent:0;mso-left-percent:-10001;mso-top-percent:-10001;v-text-anchor:top" filled="f">
             <o:lock v:ext="edit" aspectratio="t"/>
             <w10:anchorlock/>
@@ -9560,6 +9559,7 @@
           <w:kern w:val="0"/>
           <w14:ligatures w14:val="none"/>
         </w:rPr>
+        <w:lastRenderedPageBreak/>
         <w:t>All forms must have proper loading states on submit buttons ("Saving..." with spinner).</w:t>
       </w:r>
     </w:p>
@@ -9582,7 +9582,6 @@
           <w:kern w:val="0"/>
           <w14:ligatures w14:val="none"/>
         </w:rPr>
-        <w:lastRenderedPageBreak/>
         <w:t>All destructive actions (disable account, delete event) must have a confirmation modal before proceeding.</w:t>
       </w:r>
     </w:p>
@@ -9750,7 +9749,7 @@
         </w:rPr>
       </w:pPr>
       <w:r>
-        <w:pict w14:anchorId="5E2E561E">
+        <w:pict w14:anchorId="25509812">
           <v:rect id="Rectangle 45" o:spid="_x0000_s1048" alt="" style="width:468pt;height:1.1pt;visibility:visible;mso-wrap-style:square;mso-width-percent:0;mso-height-percent:0;mso-left-percent:-10001;mso-top-percent:-10001;mso-position-horizontal:absolute;mso-position-horizontal-relative:char;mso-position-vertical:absolute;mso-position-vertical-relative:line;mso-width-percent:0;mso-height-percent:0;mso-left-percent:-10001;mso-top-percent:-10001;v-text-anchor:top" filled="f">
             <o:lock v:ext="edit" aspectratio="t"/>
             <w10:anchorlock/>
@@ -9768,7 +9767,7 @@
         </w:rPr>
       </w:pPr>
       <w:r>
-        <w:pict w14:anchorId="7098D410">
+        <w:pict w14:anchorId="549B3841">
           <v:rect id="Rectangle 43" o:spid="_x0000_s1047" alt="" style="width:468pt;height:1.1pt;visibility:visible;mso-wrap-style:square;mso-width-percent:0;mso-height-percent:0;mso-left-percent:-10001;mso-top-percent:-10001;mso-position-horizontal:absolute;mso-position-horizontal-relative:char;mso-position-vertical:absolute;mso-position-vertical-relative:line;mso-width-percent:0;mso-height-percent:0;mso-left-percent:-10001;mso-top-percent:-10001;v-text-anchor:top" filled="f">
             <o:lock v:ext="edit" aspectratio="t"/>
             <w10:anchorlock/>
@@ -9786,7 +9785,7 @@
         </w:rPr>
       </w:pPr>
       <w:r>
-        <w:pict w14:anchorId="365A9568">
+        <w:pict w14:anchorId="59435781">
           <v:rect id="Rectangle 41" o:spid="_x0000_s1046" alt="" style="width:468pt;height:1.1pt;visibility:visible;mso-wrap-style:square;mso-width-percent:0;mso-height-percent:0;mso-left-percent:-10001;mso-top-percent:-10001;mso-position-horizontal:absolute;mso-position-horizontal-relative:char;mso-position-vertical:absolute;mso-position-vertical-relative:line;mso-width-percent:0;mso-height-percent:0;mso-left-percent:-10001;mso-top-percent:-10001;v-text-anchor:top" filled="f">
             <o:lock v:ext="edit" aspectratio="t"/>
             <w10:anchorlock/>
@@ -9858,7 +9857,7 @@
         </w:rPr>
       </w:pPr>
       <w:r>
-        <w:pict w14:anchorId="6216CD70">
+        <w:pict w14:anchorId="4ECE78B6">
           <v:rect id="Rectangle 39" o:spid="_x0000_s1045" alt="" style="width:468pt;height:1.1pt;visibility:visible;mso-wrap-style:square;mso-width-percent:0;mso-height-percent:0;mso-left-percent:-10001;mso-top-percent:-10001;mso-position-horizontal:absolute;mso-position-horizontal-relative:char;mso-position-vertical:absolute;mso-position-vertical-relative:line;mso-width-percent:0;mso-height-percent:0;mso-left-percent:-10001;mso-top-percent:-10001;v-text-anchor:top" filled="f">
             <o:lock v:ext="edit" aspectratio="t"/>
             <w10:anchorlock/>
@@ -9903,7 +9902,7 @@
         </w:rPr>
       </w:pPr>
       <w:r>
-        <w:pict w14:anchorId="40AE3C14">
+        <w:pict w14:anchorId="261DD910">
           <v:rect id="Rectangle 37" o:spid="_x0000_s1044" alt="" style="width:468pt;height:1.1pt;visibility:visible;mso-wrap-style:square;mso-width-percent:0;mso-height-percent:0;mso-left-percent:-10001;mso-top-percent:-10001;mso-position-horizontal:absolute;mso-position-horizontal-relative:char;mso-position-vertical:absolute;mso-position-vertical-relative:line;mso-width-percent:0;mso-height-percent:0;mso-left-percent:-10001;mso-top-percent:-10001;v-text-anchor:top" filled="f">
             <o:lock v:ext="edit" aspectratio="t"/>
             <w10:anchorlock/>
@@ -10057,7 +10056,7 @@
         </w:rPr>
       </w:pPr>
       <w:r>
-        <w:pict w14:anchorId="76CA0808">
+        <w:pict w14:anchorId="265273EE">
           <v:rect id="Rectangle 35" o:spid="_x0000_s1043" alt="" style="width:468pt;height:1.1pt;visibility:visible;mso-wrap-style:square;mso-width-percent:0;mso-height-percent:0;mso-left-percent:-10001;mso-top-percent:-10001;mso-position-horizontal:absolute;mso-position-horizontal-relative:char;mso-position-vertical:absolute;mso-position-vertical-relative:line;mso-width-percent:0;mso-height-percent:0;mso-left-percent:-10001;mso-top-percent:-10001;v-text-anchor:top" filled="f">
             <o:lock v:ext="edit" aspectratio="t"/>
             <w10:anchorlock/>
@@ -10100,6 +10099,7 @@
           <w:kern w:val="0"/>
           <w14:ligatures w14:val="none"/>
         </w:rPr>
+        <w:lastRenderedPageBreak/>
         <w:t>Create the following tables in Supabase. Apply Row Level Security (RLS) to every table.</w:t>
       </w:r>
     </w:p>
@@ -10140,7 +10140,6 @@
           <w:szCs w:val="20"/>
           <w14:ligatures w14:val="none"/>
         </w:rPr>
-        <w:lastRenderedPageBreak/>
         <w:t>-- Users / Profiles (extends Supabase auth.users)</w:t>
       </w:r>
     </w:p>
@@ -12031,6 +12030,7 @@
           <w:szCs w:val="20"/>
           <w14:ligatures w14:val="none"/>
         </w:rPr>
+        <w:lastRenderedPageBreak/>
         <w:t xml:space="preserve">  organiser TEXT,</w:t>
       </w:r>
     </w:p>
@@ -12111,7 +12111,6 @@
           <w:szCs w:val="20"/>
           <w14:ligatures w14:val="none"/>
         </w:rPr>
-        <w:lastRenderedPageBreak/>
         <w:t xml:space="preserve">  status TEXT DEFAULT 'upcoming' CHECK (status IN ('upcoming','in_progress','completed','cancelled')),</w:t>
       </w:r>
     </w:p>
@@ -13465,7 +13464,7 @@
         </w:rPr>
       </w:pPr>
       <w:r>
-        <w:pict w14:anchorId="5C40996C">
+        <w:pict w14:anchorId="361C48A1">
           <v:rect id="Rectangle 33" o:spid="_x0000_s1042" alt="" style="width:468pt;height:1.1pt;visibility:visible;mso-wrap-style:square;mso-width-percent:0;mso-height-percent:0;mso-left-percent:-10001;mso-top-percent:-10001;mso-position-horizontal:absolute;mso-position-horizontal-relative:char;mso-position-vertical:absolute;mso-position-vertical-relative:line;mso-width-percent:0;mso-height-percent:0;mso-left-percent:-10001;mso-top-percent:-10001;v-text-anchor:top" filled="f">
             <o:lock v:ext="edit" aspectratio="t"/>
             <w10:anchorlock/>
@@ -13708,6 +13707,7 @@
           <w:szCs w:val="20"/>
           <w14:ligatures w14:val="none"/>
         </w:rPr>
+        <w:lastRenderedPageBreak/>
         <w:t>-- audit_log: insert allowed for authenticated (via server-side trigger); select only for super_admin and auditor</w:t>
       </w:r>
     </w:p>
@@ -13726,7 +13726,6 @@
           <w:kern w:val="0"/>
           <w14:ligatures w14:val="none"/>
         </w:rPr>
-        <w:lastRenderedPageBreak/>
         <w:t>Write out the full RLS policy SQL for each table. Apply them.</w:t>
       </w:r>
     </w:p>
@@ -13740,7 +13739,7 @@
         </w:rPr>
       </w:pPr>
       <w:r>
-        <w:pict w14:anchorId="69C98758">
+        <w:pict w14:anchorId="4B7F30AE">
           <v:rect id="Rectangle 31" o:spid="_x0000_s1041" alt="" style="width:468pt;height:1.1pt;visibility:visible;mso-wrap-style:square;mso-width-percent:0;mso-height-percent:0;mso-left-percent:-10001;mso-top-percent:-10001;mso-position-horizontal:absolute;mso-position-horizontal-relative:char;mso-position-vertical:absolute;mso-position-vertical-relative:line;mso-width-percent:0;mso-height-percent:0;mso-left-percent:-10001;mso-top-percent:-10001;v-text-anchor:top" filled="f">
             <o:lock v:ext="edit" aspectratio="t"/>
             <w10:anchorlock/>
@@ -13868,7 +13867,7 @@
         </w:rPr>
       </w:pPr>
       <w:r>
-        <w:pict w14:anchorId="7457ADC6">
+        <w:pict w14:anchorId="78812393">
           <v:rect id="Rectangle 29" o:spid="_x0000_s1040" alt="" style="width:468pt;height:1.1pt;visibility:visible;mso-wrap-style:square;mso-width-percent:0;mso-height-percent:0;mso-left-percent:-10001;mso-top-percent:-10001;mso-position-horizontal:absolute;mso-position-horizontal-relative:char;mso-position-vertical:absolute;mso-position-vertical-relative:line;mso-width-percent:0;mso-height-percent:0;mso-left-percent:-10001;mso-top-percent:-10001;v-text-anchor:top" filled="f">
             <o:lock v:ext="edit" aspectratio="t"/>
             <w10:anchorlock/>
@@ -14306,7 +14305,7 @@
         </w:rPr>
       </w:pPr>
       <w:r>
-        <w:pict w14:anchorId="57786397">
+        <w:pict w14:anchorId="5E3478A4">
           <v:rect id="Rectangle 27" o:spid="_x0000_s1039" alt="" style="width:468pt;height:1.1pt;visibility:visible;mso-wrap-style:square;mso-width-percent:0;mso-height-percent:0;mso-left-percent:-10001;mso-top-percent:-10001;mso-position-horizontal:absolute;mso-position-horizontal-relative:char;mso-position-vertical:absolute;mso-position-vertical-relative:line;mso-width-percent:0;mso-height-percent:0;mso-left-percent:-10001;mso-top-percent:-10001;v-text-anchor:top" filled="f">
             <o:lock v:ext="edit" aspectratio="t"/>
             <w10:anchorlock/>
@@ -14353,6 +14352,7 @@
           <w:kern w:val="0"/>
           <w14:ligatures w14:val="none"/>
         </w:rPr>
+        <w:lastRenderedPageBreak/>
         <w:t>Every Supabase call wrapped in try/catch.</w:t>
       </w:r>
     </w:p>
@@ -14375,7 +14375,6 @@
           <w:kern w:val="0"/>
           <w14:ligatures w14:val="none"/>
         </w:rPr>
-        <w:lastRenderedPageBreak/>
         <w:t>On error: show toast with message "Something went wrong. Please try again." Log error to console.</w:t>
       </w:r>
     </w:p>
@@ -14411,7 +14410,7 @@
         </w:rPr>
       </w:pPr>
       <w:r>
-        <w:pict w14:anchorId="28800DC8">
+        <w:pict w14:anchorId="175B7633">
           <v:rect id="Rectangle 25" o:spid="_x0000_s1038" alt="" style="width:468pt;height:.05pt;visibility:visible;mso-wrap-style:square;mso-width-percent:0;mso-height-percent:0;mso-left-percent:-10001;mso-top-percent:-10001;mso-position-horizontal:absolute;mso-position-horizontal-relative:char;mso-position-vertical:absolute;mso-position-vertical-relative:line;mso-width-percent:0;mso-height-percent:0;mso-left-percent:-10001;mso-top-percent:-10001;v-text-anchor:top" filled="f">
             <o:lock v:ext="edit" aspectratio="t"/>
             <w10:anchorlock/>
@@ -14429,7 +14428,7 @@
         </w:rPr>
       </w:pPr>
       <w:r>
-        <w:pict w14:anchorId="20A1A6CB">
+        <w:pict w14:anchorId="4521B5D6">
           <v:rect id="Rectangle 23" o:spid="_x0000_s1037" alt="" style="width:468pt;height:.05pt;visibility:visible;mso-wrap-style:square;mso-width-percent:0;mso-height-percent:0;mso-left-percent:-10001;mso-top-percent:-10001;mso-position-horizontal:absolute;mso-position-horizontal-relative:char;mso-position-vertical:absolute;mso-position-vertical-relative:line;mso-width-percent:0;mso-height-percent:0;mso-left-percent:-10001;mso-top-percent:-10001;v-text-anchor:top" filled="f">
             <o:lock v:ext="edit" aspectratio="t"/>
             <w10:anchorlock/>
@@ -14447,7 +14446,7 @@
         </w:rPr>
       </w:pPr>
       <w:r>
-        <w:pict w14:anchorId="61103335">
+        <w:pict w14:anchorId="5E8BFFEA">
           <v:rect id="Rectangle 21" o:spid="_x0000_s1036" alt="" style="width:468pt;height:1.1pt;visibility:visible;mso-wrap-style:square;mso-width-percent:0;mso-height-percent:0;mso-left-percent:-10001;mso-top-percent:-10001;mso-position-horizontal:absolute;mso-position-horizontal-relative:char;mso-position-vertical:absolute;mso-position-vertical-relative:line;mso-width-percent:0;mso-height-percent:0;mso-left-percent:-10001;mso-top-percent:-10001;v-text-anchor:top" filled="f">
             <o:lock v:ext="edit" aspectratio="t"/>
             <w10:anchorlock/>
@@ -14519,7 +14518,7 @@
         </w:rPr>
       </w:pPr>
       <w:r>
-        <w:pict w14:anchorId="58854F79">
+        <w:pict w14:anchorId="34096DCF">
           <v:rect id="Rectangle 19" o:spid="_x0000_s1035" alt="" style="width:468pt;height:.05pt;visibility:visible;mso-wrap-style:square;mso-width-percent:0;mso-height-percent:0;mso-left-percent:-10001;mso-top-percent:-10001;mso-position-horizontal:absolute;mso-position-horizontal-relative:char;mso-position-vertical:absolute;mso-position-vertical-relative:line;mso-width-percent:0;mso-height-percent:0;mso-left-percent:-10001;mso-top-percent:-10001;v-text-anchor:top" filled="f">
             <o:lock v:ext="edit" aspectratio="t"/>
             <w10:anchorlock/>
@@ -14564,7 +14563,7 @@
         </w:rPr>
       </w:pPr>
       <w:r>
-        <w:pict w14:anchorId="19D25119">
+        <w:pict w14:anchorId="4E5E93E1">
           <v:rect id="Rectangle 17" o:spid="_x0000_s1034" alt="" style="width:468pt;height:.05pt;visibility:visible;mso-wrap-style:square;mso-width-percent:0;mso-height-percent:0;mso-left-percent:-10001;mso-top-percent:-10001;mso-position-horizontal:absolute;mso-position-horizontal-relative:char;mso-position-vertical:absolute;mso-position-vertical-relative:line;mso-width-percent:0;mso-height-percent:0;mso-left-percent:-10001;mso-top-percent:-10001;v-text-anchor:top" filled="f">
             <o:lock v:ext="edit" aspectratio="t"/>
             <w10:anchorlock/>
@@ -14814,7 +14813,7 @@
         </w:rPr>
       </w:pPr>
       <w:r>
-        <w:pict w14:anchorId="3AE47187">
+        <w:pict w14:anchorId="220DAA9C">
           <v:rect id="Rectangle 15" o:spid="_x0000_s1033" alt="" style="width:468pt;height:.05pt;visibility:visible;mso-wrap-style:square;mso-width-percent:0;mso-height-percent:0;mso-left-percent:-10001;mso-top-percent:-10001;mso-position-horizontal:absolute;mso-position-horizontal-relative:char;mso-position-vertical:absolute;mso-position-vertical-relative:line;mso-width-percent:0;mso-height-percent:0;mso-left-percent:-10001;mso-top-percent:-10001;v-text-anchor:top" filled="f">
             <o:lock v:ext="edit" aspectratio="t"/>
             <w10:anchorlock/>
@@ -14839,7 +14838,6 @@
           <w:kern w:val="0"/>
           <w14:ligatures w14:val="none"/>
         </w:rPr>
-        <w:lastRenderedPageBreak/>
         <w:t>2. Edge Case Handling</w:t>
       </w:r>
     </w:p>
@@ -15163,7 +15161,7 @@
         </w:rPr>
       </w:pPr>
       <w:r>
-        <w:pict w14:anchorId="1A57C096">
+        <w:pict w14:anchorId="30C6985D">
           <v:rect id="Rectangle 13" o:spid="_x0000_s1032" alt="" style="width:468pt;height:.05pt;visibility:visible;mso-wrap-style:square;mso-width-percent:0;mso-height-percent:0;mso-left-percent:-10001;mso-top-percent:-10001;mso-position-horizontal:absolute;mso-position-horizontal-relative:char;mso-position-vertical:absolute;mso-position-vertical-relative:line;mso-width-percent:0;mso-height-percent:0;mso-left-percent:-10001;mso-top-percent:-10001;v-text-anchor:top" filled="f">
             <o:lock v:ext="edit" aspectratio="t"/>
             <w10:anchorlock/>
@@ -15307,7 +15305,7 @@
         </w:rPr>
       </w:pPr>
       <w:r>
-        <w:pict w14:anchorId="0447FEB2">
+        <w:pict w14:anchorId="54BA286D">
           <v:rect id="Rectangle 11" o:spid="_x0000_s1031" alt="" style="width:468pt;height:1.1pt;visibility:visible;mso-wrap-style:square;mso-width-percent:0;mso-height-percent:0;mso-left-percent:-10001;mso-top-percent:-10001;mso-position-horizontal:absolute;mso-position-horizontal-relative:char;mso-position-vertical:absolute;mso-position-vertical-relative:line;mso-width-percent:0;mso-height-percent:0;mso-left-percent:-10001;mso-top-percent:-10001;v-text-anchor:top" filled="f">
             <o:lock v:ext="edit" aspectratio="t"/>
             <w10:anchorlock/>
@@ -15354,6 +15352,7 @@
           <w:kern w:val="0"/>
           <w14:ligatures w14:val="none"/>
         </w:rPr>
+        <w:lastRenderedPageBreak/>
         <w:t>Confirm no Supabase service role key is exposed in the frontend. Only anon key in environment variables.</w:t>
       </w:r>
     </w:p>
@@ -15376,7 +15375,6 @@
           <w:kern w:val="0"/>
           <w14:ligatures w14:val="none"/>
         </w:rPr>
-        <w:lastRenderedPageBreak/>
         <w:t xml:space="preserve">Confirm all file uploads go to the private </w:t>
       </w:r>
       <w:r>
@@ -15492,7 +15490,7 @@
         </w:rPr>
       </w:pPr>
       <w:r>
-        <w:pict w14:anchorId="4F59B28D">
+        <w:pict w14:anchorId="686597BB">
           <v:rect id="Rectangle 9" o:spid="_x0000_s1030" alt="" style="width:468pt;height:.05pt;visibility:visible;mso-wrap-style:square;mso-width-percent:0;mso-height-percent:0;mso-left-percent:-10001;mso-top-percent:-10001;mso-position-horizontal:absolute;mso-position-horizontal-relative:char;mso-position-vertical:absolute;mso-position-vertical-relative:line;mso-width-percent:0;mso-height-percent:0;mso-left-percent:-10001;mso-top-percent:-10001;v-text-anchor:top" filled="f">
             <o:lock v:ext="edit" aspectratio="t"/>
             <w10:anchorlock/>
@@ -15596,7 +15594,7 @@
         </w:rPr>
       </w:pPr>
       <w:r>
-        <w:pict w14:anchorId="36857692">
+        <w:pict w14:anchorId="367B4D39">
           <v:rect id="Rectangle 7" o:spid="_x0000_s1029" alt="" style="width:468pt;height:.05pt;visibility:visible;mso-wrap-style:square;mso-width-percent:0;mso-height-percent:0;mso-left-percent:-10001;mso-top-percent:-10001;mso-position-horizontal:absolute;mso-position-horizontal-relative:char;mso-position-vertical:absolute;mso-position-vertical-relative:line;mso-width-percent:0;mso-height-percent:0;mso-left-percent:-10001;mso-top-percent:-10001;v-text-anchor:top" filled="f">
             <o:lock v:ext="edit" aspectratio="t"/>
             <w10:anchorlock/>
@@ -15736,7 +15734,7 @@
         </w:rPr>
       </w:pPr>
       <w:r>
-        <w:pict w14:anchorId="51074D3A">
+        <w:pict w14:anchorId="2620182C">
           <v:rect id="Rectangle 5" o:spid="_x0000_s1028" alt="" style="width:468pt;height:.05pt;visibility:visible;mso-wrap-style:square;mso-width-percent:0;mso-height-percent:0;mso-left-percent:-10001;mso-top-percent:-10001;mso-position-horizontal:absolute;mso-position-horizontal-relative:char;mso-position-vertical:absolute;mso-position-vertical-relative:line;mso-width-percent:0;mso-height-percent:0;mso-left-percent:-10001;mso-top-percent:-10001;v-text-anchor:top" filled="f">
             <o:lock v:ext="edit" aspectratio="t"/>
             <w10:anchorlock/>
@@ -15911,6 +15909,7 @@
           <w:kern w:val="0"/>
           <w14:ligatures w14:val="none"/>
         </w:rPr>
+        <w:lastRenderedPageBreak/>
         <w:t>[ ] All 5 reports generate correctly from live data</w:t>
       </w:r>
     </w:p>
@@ -15955,7 +15954,6 @@
           <w:kern w:val="0"/>
           <w14:ligatures w14:val="none"/>
         </w:rPr>
-        <w:lastRenderedPageBreak/>
         <w:t>[ ] Members can be created, roles changed, accounts disabled</w:t>
       </w:r>
     </w:p>
@@ -16101,7 +16099,7 @@
         </w:rPr>
       </w:pPr>
       <w:r>
-        <w:pict w14:anchorId="49B3292B">
+        <w:pict w14:anchorId="42D77C54">
           <v:rect id="Rectangle 3" o:spid="_x0000_s1027" alt="" style="width:468pt;height:.05pt;visibility:visible;mso-wrap-style:square;mso-width-percent:0;mso-height-percent:0;mso-left-percent:-10001;mso-top-percent:-10001;mso-position-horizontal:absolute;mso-position-horizontal-relative:char;mso-position-vertical:absolute;mso-position-vertical-relative:line;mso-width-percent:0;mso-height-percent:0;mso-left-percent:-10001;mso-top-percent:-10001;v-text-anchor:top" filled="f">
             <o:lock v:ext="edit" aspectratio="t"/>
             <w10:anchorlock/>
@@ -16139,7 +16137,7 @@
         </w:rPr>
       </w:pPr>
       <w:r>
-        <w:pict w14:anchorId="642B4694">
+        <w:pict w14:anchorId="6178263F">
           <v:rect id="Rectangle 1" o:spid="_x0000_s1026" alt="" style="width:468pt;height:1.1pt;visibility:visible;mso-wrap-style:square;mso-width-percent:0;mso-height-percent:0;mso-left-percent:-10001;mso-top-percent:-10001;mso-position-horizontal:absolute;mso-position-horizontal-relative:char;mso-position-vertical:absolute;mso-position-vertical-relative:line;mso-width-percent:0;mso-height-percent:0;mso-left-percent:-10001;mso-top-percent:-10001;v-text-anchor:top" filled="f">
             <o:lock v:ext="edit" aspectratio="t"/>
             <w10:anchorlock/>

</xml_diff>